<commit_message>
Stimuli performance report has been copied, edited, and submitted to Prof. Marcel
</commit_message>
<xml_diff>
--- a/Stimuli and Performance Exploring  copy.docx
+++ b/Stimuli and Performance Exploring  copy.docx
@@ -1059,10 +1059,7 @@
         <w:ind w:firstLine="360"/>
       </w:pPr>
       <w:r>
-        <w:t>Based on the data</w:t>
-      </w:r>
-      <w:r>
-        <w:t xml:space="preserve"> in </w:t>
+        <w:t xml:space="preserve">Based on the data in </w:t>
       </w:r>
       <w:r>
         <w:rPr>
@@ -1092,7 +1089,7 @@
         <w:t>Gap 11</w:t>
       </w:r>
       <w:r>
-        <w:t>, reaches the ceiling with a perfect hit rate of 100% and a high D-prime of 3.1122. Extreme high-performance levels are also observed in Gaps 6, 7, 9, and 10, where hit rates consistently exceed 92%. In contrast, Gaps 2 through 5 and Gap 8 represent the intermediate levels, as their hit rates and D-prime values sit between the extremes. These intermediate levels are the most valuable for the study because they avoid the mathematical limitations of floor and ceiling effects.</w:t>
+        <w:t xml:space="preserve">, reaches the ceiling with a perfect hit rate of 100% and a high D-prime of 3.1122. </w:t>
       </w:r>
     </w:p>
     <w:p>
@@ -1127,7 +1124,6 @@
           <w:b/>
           <w:bCs/>
         </w:rPr>
-        <w:lastRenderedPageBreak/>
         <w:t xml:space="preserve"> Does hit rate increase as the difference between figures increases?</w:t>
       </w:r>
     </w:p>
@@ -1198,59 +1194,7 @@
         <w:t>an</w:t>
       </w:r>
       <w:r>
-        <w:t xml:space="preserve"> indication which stimuli contribute to the variance better. As the difference between the figures becomes larger sensitivity increases. This is exactly what we expect. For </w:t>
-      </w:r>
-      <w:r>
-        <w:t xml:space="preserve">the </w:t>
-      </w:r>
-      <w:r>
-        <w:t>levels 2–</w:t>
-      </w:r>
-      <w:r>
-        <w:t>5</w:t>
-      </w:r>
-      <w:r>
-        <w:t xml:space="preserve"> and 8</w:t>
-      </w:r>
-      <w:r>
-        <w:t>,</w:t>
-      </w:r>
-      <w:r>
-        <w:t xml:space="preserve"> the</w:t>
-      </w:r>
-      <w:r>
-        <w:t xml:space="preserve"> </w:t>
-      </w:r>
-      <w:r>
-        <w:rPr>
-          <w:i/>
-          <w:iCs/>
-        </w:rPr>
-        <w:t>d′</w:t>
-      </w:r>
-      <w:r>
-        <w:t xml:space="preserve"> increases gradually and there is variability between levels. So</w:t>
-      </w:r>
-      <w:r>
-        <w:t>,</w:t>
-      </w:r>
-      <w:r>
-        <w:t xml:space="preserve"> this is the most informative part of the scale. Levels </w:t>
-      </w:r>
-      <w:r>
-        <w:t>9</w:t>
-      </w:r>
-      <w:r>
-        <w:t xml:space="preserve">-11 approaching ceiling effects and less informative and level 1 is very </w:t>
-      </w:r>
-      <w:r>
-        <w:t>difficult,</w:t>
-      </w:r>
-      <w:r>
-        <w:t xml:space="preserve"> so performance is close to floor (almost no discrimination). </w:t>
-      </w:r>
-      <w:r>
-        <w:t xml:space="preserve"> </w:t>
+        <w:t xml:space="preserve"> indication which stimuli contribute to the variance better. </w:t>
       </w:r>
     </w:p>
     <w:p/>
@@ -1434,12 +1378,6 @@
       </w:r>
     </w:p>
     <w:p/>
-    <w:p/>
-    <w:p/>
-    <w:p/>
-    <w:p/>
-    <w:p/>
-    <w:p/>
     <w:p>
       <w:pPr>
         <w:pStyle w:val="ListParagraph"/>
@@ -1457,7 +1395,6 @@
           <w:b/>
           <w:bCs/>
         </w:rPr>
-        <w:lastRenderedPageBreak/>
         <w:t>Is there any extreme effect of the orientation?</w:t>
       </w:r>
     </w:p>
@@ -2875,13 +2812,13 @@
         <w:t>plus30_vs_minus30</w:t>
       </w:r>
       <w:r>
-        <w:t xml:space="preserve"> groups yielded hit rates of 75% and 79.16%, respectively. These values demonstrate that performance remains well-distributed and does not hit the "floor" or "ceiling" </w:t>
-      </w:r>
-      <w:r>
-        <w:t>performance</w:t>
-      </w:r>
-      <w:r>
-        <w:t>. Because the participants are neither always correct nor always wrong, these stimuli are highly effective for measuring sensory thresholds. This stability across orientations suggests that the direction of the tilt does not disproportionately hinder or help the participant's detection ability.</w:t>
+        <w:t xml:space="preserve"> groups yielded hit rates of 75% and 79.16%, respectively</w:t>
+      </w:r>
+      <w:r>
+        <w:t xml:space="preserve"> that is between the range</w:t>
+      </w:r>
+      <w:r>
+        <w:t xml:space="preserve">. </w:t>
       </w:r>
     </w:p>
     <w:sectPr>

</xml_diff>